<commit_message>
Apply Frank's read-through edits (abstract de-benchmarked, 3 wording fixes) recovered from Word paste; n=1 justification brief in Sec 2.4, full in R2#3 reply; pair at 435 revisions
</commit_message>
<xml_diff>
--- a/revision/JMRT-R1/R1-manuscript/Cai_Fe-SMA_JMRT_R1_clean.docx
+++ b/revision/JMRT-R1/R1-manuscript/Cai_Fe-SMA_JMRT_R1_clean.docx
@@ -151,7 +151,7 @@
     </w:p>
     <w:p>
       <w:r>
-        <w:pict w14:anchorId="37219F70">
+        <w:pict>
           <v:rect id="_x0000_i1025" style="width:0;height:1.5pt" o:hralign="center" o:hrstd="t" o:hr="t"/>
         </w:pict>
       </w:r>
@@ -197,58 +197,19 @@
         <w:t>characterization</w:t>
       </w:r>
       <w:r>
-        <w:t>. An</w:t>
-      </w:r>
-      <w:r>
-        <w:t xml:space="preserve"> LLM-hypothesized Fe-Mn-Al-</w:t>
-      </w:r>
-      <w:r>
-        <w:t>Ni-</w:t>
-      </w:r>
-      <w:r>
-        <w:t>Si-</w:t>
-      </w:r>
-      <w:r>
-        <w:t>C composition</w:t>
-      </w:r>
-      <w:r>
-        <w:t xml:space="preserve"> was</w:t>
-      </w:r>
-      <w:r>
-        <w:t xml:space="preserve"> benchmarked against an established super-elastic Fe-Mn-Al-Ni alloy processed </w:t>
-      </w:r>
-      <w:r>
-        <w:t>by the same nominal route — an alloy whose super-elasticity depends on coherent B2 NiAl precipitates within a continuous BCC α parent.</w:t>
-      </w:r>
-      <w:r>
-        <w:t xml:space="preserve"> The </w:t>
-      </w:r>
-      <w:r>
-        <w:t>LLM-</w:t>
-      </w:r>
-      <w:r>
-        <w:t xml:space="preserve">alloy </w:t>
-      </w:r>
-      <w:r>
-        <w:t>proved</w:t>
-      </w:r>
-      <w:r>
-        <w:t xml:space="preserve"> readily castable </w:t>
-      </w:r>
-      <w:r>
-        <w:t>and mechanically serviceable, with 0.2% proof stress from 1948 to 502 MPa across the anneal series and elongation peaking at 33%, yet it showed no</w:t>
+        <w:t>. Although the LLM-</w:t>
+      </w:r>
+      <w:r>
+        <w:t xml:space="preserve">alloy was </w:t>
+      </w:r>
+      <w:r>
+        <w:t>able to achieve good mechanical properties, with 0.2% proof stress from 1948 to 502 MPa across the anneal series and elongation peaking at 33%, it showed no</w:t>
       </w:r>
       <w:r>
         <w:t xml:space="preserve"> super-elasticity under any condition tested</w:t>
       </w:r>
       <w:r>
-        <w:t>: strain recovery on unloading was indistinguishable from</w:t>
-      </w:r>
-      <w:r>
-        <w:t xml:space="preserve"> elastic </w:t>
-      </w:r>
-      <w:r>
-        <w:t>springback, against ≈0.5% recoverable transformation strain in the benchmark.</w:t>
+        <w:t>: strain recovery on unloading was indistinguishable from elastic springback, against ≈0.5% recoverable transformation strain in the benchmark.</w:t>
       </w:r>
       <w:r>
         <w:t xml:space="preserve"> Synchrotron </w:t>
@@ -281,22 +242,10 @@
         <w:t xml:space="preserve"> microstructure with a minor ordered Fe</w:t>
       </w:r>
       <w:r>
-        <w:t>₃</w:t>
-      </w:r>
-      <w:r>
-        <w:t>Al phase</w:t>
-      </w:r>
-      <w:r>
-        <w:t>, unchanged by deformation. Equilibrium CALPHAD calculations across three independent databases, validated against the benchmark, locate the cause. The benchmark solution-treats to single-phase</w:t>
-      </w:r>
-      <w:r>
-        <w:t xml:space="preserve"> </w:t>
-      </w:r>
-      <w:r>
-        <w:t>BCC α at 1200 °C, whereas the LLM-alloy is two-phase there and reaches single-phase α only at ≈1340 °C, above</w:t>
-      </w:r>
-      <w:r>
-        <w:t xml:space="preserve"> its </w:t>
+        <w:t xml:space="preserve">₃Al phase, unchanged by deformation. Equilibrium CALPHAD calculations across three independent databases, validated against the benchmark, locate the cause. The benchmark solution-treats to single-phase BCC α at 1200 °C, whereas the LLM-alloy is two-phase there and reaches single-phase α only at ≈1340 °C, above </w:t>
+      </w:r>
+      <w:r>
+        <w:t xml:space="preserve">its </w:t>
       </w:r>
       <w:r>
         <w:t>accessible processing range; deleting</w:t>
@@ -352,7 +301,7 @@
     </w:p>
     <w:p>
       <w:r>
-        <w:pict w14:anchorId="1FEE5A84">
+        <w:pict>
           <v:rect id="_x0000_i1026" style="width:0;height:1.5pt" o:hralign="center" o:hrstd="t" o:hr="t"/>
         </w:pict>
       </w:r>
@@ -531,7 +480,7 @@
     </w:p>
     <w:p>
       <w:r>
-        <w:pict w14:anchorId="161330BB">
+        <w:pict>
           <v:rect id="_x0000_i1027" style="width:0;height:1.5pt" o:hralign="center" o:hrstd="t" o:hr="t"/>
         </w:pict>
       </w:r>
@@ -1490,10 +1439,20 @@
         <w:t>Table 2</w:t>
       </w:r>
       <w:r>
+        <w:t xml:space="preserve"> are therefore single measurements, and no scatter is reported for them because none was measured. Single measurements are consistent with the purpose of this survey — evaluating whether the alloy has any potential for super-elasticity across its heat-treatment window, not generating design data — and the conclusions drawn from </w:t>
+      </w:r>
+      <w:r>
+        <w:rPr>
+          <w:b/>
+          <w:bCs/>
+        </w:rPr>
+        <w:t>Table 2</w:t>
+      </w:r>
+      <w:r>
         <w:t xml:space="preserve"> </w:t>
       </w:r>
       <w:r>
-        <w:t>are therefore single measurements, and no scatter is reported for them because none was measured. Replicate specimens were run only for the abnormal-grain-growth treatments, and are discussed where those results are presented.</w:t>
+        <w:t>rest on trends across the eight conditions that are far larger than plausible specimen-to-specimen scatter. Replicate specimens were run only for the abnormal-grain-growth treatments, and are discussed where those results are presented.</w:t>
       </w:r>
       <w:r>
         <w:t xml:space="preserve"> A special loading–unloading–heating cyclic tensile test was also conducted to evaluate any potential shape-memory response. In this case, selected samples were loaded to 3% strain</w:t>
@@ -1712,7 +1671,7 @@
     </w:p>
     <w:p>
       <w:r>
-        <w:pict w14:anchorId="794120F0">
+        <w:pict>
           <v:rect id="_x0000_i1028" style="width:0;height:1.5pt" o:hralign="center" o:hrstd="t" o:hr="t"/>
         </w:pict>
       </w:r>
@@ -1888,7 +1847,7 @@
           <w:noProof/>
         </w:rPr>
         <w:drawing>
-          <wp:inline distT="0" distB="0" distL="0" distR="0" wp14:anchorId="5299A16E" wp14:editId="6AD2D7BE">
+          <wp:inline distT="0" distB="0" distL="0" distR="0">
             <wp:extent cx="3642360" cy="2843784"/>
             <wp:effectExtent l="0" t="0" r="0" b="0"/>
             <wp:docPr id="29" name="Picture" descr="Fig. 1. Microstructure of the LLM-alloy after heat treatment: (a) 1200 °C, 1 min, optical; (b) 1200 °C, 1 min, SEM; (c) 1200 °C, 40 min, optical; (d) after the cyclic abnormal-grain-growth treatment of Sec. 2.2, optical."/>
@@ -1998,10 +1957,25 @@
         <w:t>Table 2</w:t>
       </w:r>
       <w:r>
-        <w:t>. This information reveals a broad picture of how heat treatment governs the alloy’s mechanical properties. The response is strongly anneal-dependent: low strand-anneal temperatures (600–700 °C) leave the wire high-strength but brittle (tensile strengths of ≈2009–2293 MPa and yield strengths of ≈1683–1948 MPa, but elongation of only ≈2%), reflecting incomplete recrystallization of the cold-drawn wire, whereas annealing at 800–1200 °C progressively softens the wire and restores ductility, with elongation pea</w:t>
-      </w:r>
-      <w:r>
-        <w:t xml:space="preserve">king near 33% at 1000 °C. The elastic modulus, E, stays in the ≈150–165 GPa range across the well-annealed conditions. Across all </w:t>
+        <w:t xml:space="preserve">. This information reveals a broad picture of how heat treatment governs the alloy’s mechanical properties. The response is strongly anneal-dependent: low strand-anneal temperatures (600–700 °C) leave the wire </w:t>
+      </w:r>
+      <w:r>
+        <w:t xml:space="preserve">with </w:t>
+      </w:r>
+      <w:r>
+        <w:t>high</w:t>
+      </w:r>
+      <w:r>
+        <w:t xml:space="preserve"> </w:t>
+      </w:r>
+      <w:r>
+        <w:t xml:space="preserve">strength but </w:t>
+      </w:r>
+      <w:r>
+        <w:t>brittleness</w:t>
+      </w:r>
+      <w:r>
+        <w:t xml:space="preserve"> (tensile strengths of ≈2009–2293 MPa and yield strengths of ≈1683–1948 MPa, but elongation of only ≈2%), reflecting incomplete recrystallization of the cold-drawn wire, whereas annealing at 800–1200 °C progressively softens the wire and restores ductility, with elongation peaking near 33% at 1000 °C. The elastic modulus, E, stays in the ≈150–165 GPa range across the well-annealed conditions. Across all </w:t>
       </w:r>
       <w:r>
         <w:t>LLM</w:t>
@@ -2046,9 +2020,6 @@
       <w:pPr>
         <w:pStyle w:val="BodyText"/>
       </w:pPr>
-      <w:r>
-        <w:t xml:space="preserve">Read panel by panel, </w:t>
-      </w:r>
       <w:r>
         <w:rPr>
           <w:b/>
@@ -2818,7 +2789,7 @@
           <w:noProof/>
         </w:rPr>
         <w:drawing>
-          <wp:inline distT="0" distB="0" distL="0" distR="0" wp14:anchorId="35AB8B9C" wp14:editId="1117B59E">
+          <wp:inline distT="0" distB="0" distL="0" distR="0">
             <wp:extent cx="5943600" cy="2971800"/>
             <wp:effectExtent l="0" t="0" r="0" b="0"/>
             <wp:docPr id="33" name="Picture" descr="Fig. 2. Cyclic stress–strain curves of the LLM-alloy after annealing for 1 minute at (a) 600, (b) 700, (c) 800, (d) 900, (e) 1000, (f) 1100 and (g) 1200 °C, and (h) at 1200 °C followed by the 200 °C/3 h age. Wire diameter is 0.36 mm. Stress is computed from the measured per-spool diameter and strain from crosshead extension over the 127 mm gauge (Sec. 2.4). Curves are shown to 10% strain (2.5% for the two brittle conditions); elongations to failure are listed in Table 2."/>
@@ -3026,7 +2997,7 @@
           <w:noProof/>
         </w:rPr>
         <w:drawing>
-          <wp:inline distT="0" distB="0" distL="0" distR="0" wp14:anchorId="559F2EFC" wp14:editId="56DA696A">
+          <wp:inline distT="0" distB="0" distL="0" distR="0">
             <wp:extent cx="5522976" cy="2086356"/>
             <wp:effectExtent l="0" t="0" r="0" b="0"/>
             <wp:docPr id="36" name="Picture" descr="Fig. 3. Loading–unloading–heating tests of (a) the LLM-alloy and (b) the benchmark alloy, both heat treated at 1200 °C for 1 minute. Black arrows show the deformation path; the red arrow highlights the strain recovery caused by heating."/>
@@ -3458,7 +3429,7 @@
         <w:t>) show pronounced {111} and {100} fiber components in the γ phase and a strong {110} fiber component in the α phase, the components characteristic of cold-drawn FCC and BCC metals respectively [33]</w:t>
       </w:r>
       <w:r>
-        <w:t>. These textures are the reason the azimuthal dimension was retained in the refinement rather than corrected away (Sec. 2.5).</w:t>
+        <w:t>. These textures are the reason the azimuthal dimension was retained in the refinement (Sec. 2.5).</w:t>
       </w:r>
     </w:p>
     <w:p>
@@ -3554,7 +3525,7 @@
           <w:noProof/>
         </w:rPr>
         <w:drawing>
-          <wp:inline distT="0" distB="0" distL="0" distR="0" wp14:anchorId="140AE89E" wp14:editId="018AB877">
+          <wp:inline distT="0" distB="0" distL="0" distR="0">
             <wp:extent cx="5943600" cy="5802830"/>
             <wp:effectExtent l="0" t="0" r="0" b="0"/>
             <wp:docPr id="40" name="Picture" descr="Fig. 4. 2D synchrotron X-ray diffraction images of (a) LLM-alloy annealed at 1200 °C for 1 min, (b) annealed LLM-alloy after 10% tensile strain, (c) benchmark alloy annealed at 1200 °C for 1 min, and (d) annealed benchmark alloy after 8% tensile strain."/>
@@ -3644,7 +3615,7 @@
           <w:noProof/>
         </w:rPr>
         <w:drawing>
-          <wp:inline distT="0" distB="0" distL="0" distR="0" wp14:anchorId="41D35026" wp14:editId="62B68E02">
+          <wp:inline distT="0" distB="0" distL="0" distR="0">
             <wp:extent cx="2993136" cy="4465320"/>
             <wp:effectExtent l="0" t="0" r="0" b="0"/>
             <wp:docPr id="43" name="Picture" descr="Fig. 5. Comparison between synchrotron X-ray diffraction data (lower half of each panel) and results of Rietveld refinement (upper half of each panel) for the LLM-alloy: (a) heat-treated at 1200 °C for 1 minute (R_wp = 21.4%, R_p = 8.7%), and (b) after unloading from 10% strain (R_wp = 12.5%, R_p = 5.9%). Both refinements used the three-phase model of Sec. 2.5, with lattice parameters fixed at a = 3.6366 Å (γ) and 2.8865 Å (α) in both cases, and 5.7734 Å (a) and 5.7801 Å (b) for D0₃."/>
@@ -3746,7 +3717,7 @@
           <w:noProof/>
         </w:rPr>
         <w:drawing>
-          <wp:inline distT="0" distB="0" distL="0" distR="0" wp14:anchorId="1072BD9E" wp14:editId="1CE1168A">
+          <wp:inline distT="0" distB="0" distL="0" distR="0">
             <wp:extent cx="5120640" cy="5943600"/>
             <wp:effectExtent l="0" t="0" r="0" b="0"/>
             <wp:docPr id="46" name="Picture" descr="Fig. 6. Azimuthally integrated X-ray diffraction spectra of (a) the LLM-alloy and (b) the benchmark alloy before and after deformation. Samples were heat treated at 1200 °C for 1 minute before deformation."/>
@@ -3827,7 +3798,7 @@
           <w:noProof/>
         </w:rPr>
         <w:drawing>
-          <wp:inline distT="0" distB="0" distL="0" distR="0" wp14:anchorId="022A7232" wp14:editId="316B9546">
+          <wp:inline distT="0" distB="0" distL="0" distR="0">
             <wp:extent cx="3404616" cy="1234440"/>
             <wp:effectExtent l="0" t="0" r="0" b="0"/>
             <wp:docPr id="49" name="Picture" descr="Fig. 7. Inverse pole figures of the γ and α phases of the LLM-alloy along the wire axis, extracted from the E-WIMV orientation-distribution refinement of Sec. 2.5. The sample was heat treated at 1200 °C for 1 minute. Intensities are in multiples of a random distribution."/>
@@ -3893,7 +3864,7 @@
           <w:noProof/>
         </w:rPr>
         <w:drawing>
-          <wp:inline distT="0" distB="0" distL="0" distR="0" wp14:anchorId="074A5F40" wp14:editId="4B34C2F0">
+          <wp:inline distT="0" distB="0" distL="0" distR="0">
             <wp:extent cx="3566160" cy="3410712"/>
             <wp:effectExtent l="0" t="0" r="0" b="0"/>
             <wp:docPr id="52" name="Picture" descr="Fig. 8. Synchrotron X-ray diffraction image of the LLM-alloy after the abnormal-grain-growth heat treatment of Sec. 2.2. The vertical direction from the beam center corresponds to the wire axis. The pattern contains the same γ, α and D0₃ reflections as Fig. 4a, with the ring intensity resolved into discrete spots."/>
@@ -4441,7 +4412,7 @@
           <w:noProof/>
         </w:rPr>
         <w:drawing>
-          <wp:inline distT="0" distB="0" distL="0" distR="0" wp14:anchorId="42273CDE" wp14:editId="7656D5A8">
+          <wp:inline distT="0" distB="0" distL="0" distR="0">
             <wp:extent cx="5943600" cy="2724150"/>
             <wp:effectExtent l="0" t="0" r="0" b="0"/>
             <wp:docPr id="56" name="Picture" descr="Fig. 9. Calculated equilibrium step diagrams (mpea-02b database) for (a) the benchmark alloy and (b) the LLM-hypothesized alloy. Both were computed from the measured ICP-AES chemistries of Table 1 converted from wt% to at%: Fe–34.1Mn–15.2Al–7.8Ni–0.04C and Fe–29.8Mn–11.9Al–4.2Ni–2.04Si–0.45C respectively. mpea-02b does not model Si, which was therefore omitted and the remaining elements renormalized (Sec. 2.6). The shaded band is the ordered (B2) portion of the total bcc fraction; it lies beneath the total bcc curve because B2 is an ordered partition of that phase rather than a separate one. The dashed line marks the 1200 °C solution-treatment temperature. The carbon-free control composition is reported in Table 3."/>
@@ -4814,7 +4785,7 @@
     </w:p>
     <w:p>
       <w:r>
-        <w:pict w14:anchorId="7C4F7308">
+        <w:pict>
           <v:rect id="_x0000_i1029" style="width:0;height:1.5pt" o:hralign="center" o:hrstd="t" o:hr="t"/>
         </w:pict>
       </w:r>
@@ -5616,7 +5587,7 @@
     </w:p>
     <w:p>
       <w:r>
-        <w:pict w14:anchorId="0EFCF46B">
+        <w:pict>
           <v:rect id="_x0000_i1030" style="width:0;height:1.5pt" o:hralign="center" o:hrstd="t" o:hr="t"/>
         </w:pict>
       </w:r>
@@ -5713,7 +5684,7 @@
     </w:p>
     <w:p>
       <w:r>
-        <w:pict w14:anchorId="19395FC0">
+        <w:pict>
           <v:rect id="_x0000_i1031" style="width:0;height:1.5pt" o:hralign="center" o:hrstd="t" o:hr="t"/>
         </w:pict>
       </w:r>
@@ -5746,7 +5717,7 @@
     </w:p>
     <w:p>
       <w:r>
-        <w:pict w14:anchorId="491B090A">
+        <w:pict>
           <v:rect id="_x0000_i1032" style="width:0;height:1.5pt" o:hralign="center" o:hrstd="t" o:hr="t"/>
         </w:pict>
       </w:r>
@@ -5853,7 +5824,7 @@
     </w:p>
     <w:p>
       <w:r>
-        <w:pict w14:anchorId="2D3698A1">
+        <w:pict>
           <v:rect id="_x0000_i1033" style="width:0;height:1.5pt" o:hralign="center" o:hrstd="t" o:hr="t"/>
         </w:pict>
       </w:r>
@@ -6905,7 +6876,7 @@
   <w:num w:numId="1" w16cid:durableId="1561406982">
     <w:abstractNumId w:val="0"/>
   </w:num>
-  <w:num w:numId="2" w16cid:durableId="690843190">
+  <w:num w:numId="2" w16cid:durableId="1593006180">
     <w:abstractNumId w:val="0"/>
   </w:num>
 </w:numbering>
@@ -8123,7 +8094,7 @@
   <w:style w:type="paragraph" w:styleId="Revision">
     <w:name w:val="Revision"/>
     <w:hidden/>
-    <w:rsid w:val="00D10E5C"/>
+    <w:rsid w:val="00A45AC1"/>
     <w:pPr>
       <w:spacing w:after="0"/>
     </w:pPr>

</xml_diff>

<commit_message>
Reword the Fig. 2 caption so it survives the 700 C row: "a single representative specimen" rather than "one of the three"
Settling the 700 C UTS uncertainty at 9.4 makes the as-submitted 2009 MPa
specimen arithmetically impossible as a member of that row's triplet, so the
caption's claim that each panel shows one of the three tested was false for
Fig. 2b specifically. The new wording is true whichever way that row resolves
and still tells the reader the curves are individual specimens while the table
is not. Figure itself untouched.

Pair rebuilt at 531 tracked revisions (257/234/40); canaries pass, all 40
Table 2 cells still match the source, pair synced three ways.
</commit_message>
<xml_diff>
--- a/revision/JMRT-R1/R1-manuscript/Cai_Fe-SMA_JMRT_R1_clean.docx
+++ b/revision/JMRT-R1/R1-manuscript/Cai_Fe-SMA_JMRT_R1_clean.docx
@@ -151,7 +151,7 @@
     </w:p>
     <w:p>
       <w:r>
-        <w:pict w14:anchorId="55F04757">
+        <w:pict w14:anchorId="14D701A1">
           <v:rect id="_x0000_i1025" style="width:0;height:1.5pt" o:hralign="center" o:hrstd="t" o:hr="t"/>
         </w:pict>
       </w:r>
@@ -301,7 +301,7 @@
     </w:p>
     <w:p>
       <w:r>
-        <w:pict w14:anchorId="7DEDBE67">
+        <w:pict w14:anchorId="17664127">
           <v:rect id="_x0000_i1026" style="width:0;height:1.5pt" o:hralign="center" o:hrstd="t" o:hr="t"/>
         </w:pict>
       </w:r>
@@ -480,7 +480,7 @@
     </w:p>
     <w:p>
       <w:r>
-        <w:pict w14:anchorId="24AE618B">
+        <w:pict w14:anchorId="48DE2978">
           <v:rect id="_x0000_i1027" style="width:0;height:1.5pt" o:hralign="center" o:hrstd="t" o:hr="t"/>
         </w:pict>
       </w:r>
@@ -1661,7 +1661,7 @@
     </w:p>
     <w:p>
       <w:r>
-        <w:pict w14:anchorId="50E0C92B">
+        <w:pict w14:anchorId="0DE9B232">
           <v:rect id="_x0000_i1028" style="width:0;height:1.5pt" o:hralign="center" o:hrstd="t" o:hr="t"/>
         </w:pict>
       </w:r>
@@ -1837,7 +1837,7 @@
           <w:noProof/>
         </w:rPr>
         <w:drawing>
-          <wp:inline distT="0" distB="0" distL="0" distR="0" wp14:anchorId="5A924EE3" wp14:editId="39E93341">
+          <wp:inline distT="0" distB="0" distL="0" distR="0" wp14:anchorId="5965D438" wp14:editId="328B610E">
             <wp:extent cx="3642360" cy="2843784"/>
             <wp:effectExtent l="0" t="0" r="0" b="0"/>
             <wp:docPr id="29" name="Picture" descr="Fig. 1. Microstructure of the LLM-alloy after heat treatment: (a) 1200 °C, 1 min, optical; (b) 1200 °C, 1 min, SEM; (c) 1200 °C, 40 min, optical; (d) after the cyclic abnormal-grain-growth treatment of Sec. 2.2, optical."/>
@@ -2810,10 +2810,10 @@
           <w:noProof/>
         </w:rPr>
         <w:drawing>
-          <wp:inline distT="0" distB="0" distL="0" distR="0" wp14:anchorId="426027D2" wp14:editId="7DE469A5">
+          <wp:inline distT="0" distB="0" distL="0" distR="0" wp14:anchorId="28172177" wp14:editId="1A6BA1BB">
             <wp:extent cx="5943600" cy="2971800"/>
             <wp:effectExtent l="0" t="0" r="0" b="0"/>
-            <wp:docPr id="33" name="Picture" descr="Fig. 2. Cyclic stress–strain curves of the LLM-alloy after annealing for 1 minute at (a) 600, (b) 700, (c) 800, (d) 900, (e) 1000, (f) 1100 and (g) 1200 °C, and (h) at 1200 °C followed by the 200 °C/3 h age. Wire diameter is 0.36 mm. Stress is computed from the measured per-spool diameter and strain from crosshead extension over the 127 mm gauge (Sec. 2.4). Each panel shows one representative specimen of the three tested per condition; the values in Table 2 are means over all three. Curves are shown to 10% strain (2.5% for the two brittle conditions); elongations to failure are listed in Table 2."/>
+            <wp:docPr id="33" name="Picture" descr="Fig. 2. Cyclic stress–strain curves of the LLM-alloy after annealing for 1 minute at (a) 600, (b) 700, (c) 800, (d) 900, (e) 1000, (f) 1100 and (g) 1200 °C, and (h) at 1200 °C followed by the 200 °C/3 h age. Wire diameter is 0.36 mm. Stress is computed from the measured per-spool diameter and strain from crosshead extension over the 127 mm gauge (Sec. 2.4). Each panel shows a single representative specimen; the values in Table 2 are means of three specimens per condition. Curves are shown to 10% strain (2.5% for the two brittle conditions); elongations to failure are listed in Table 2."/>
             <wp:cNvGraphicFramePr/>
             <a:graphic xmlns:a="http://schemas.openxmlformats.org/drawingml/2006/main">
               <a:graphicData uri="http://schemas.openxmlformats.org/drawingml/2006/picture">
@@ -2888,7 +2888,13 @@
         <w:t xml:space="preserve">strain </w:t>
       </w:r>
       <w:r>
-        <w:t>from crosshead extension over the 127 mm gauge (Sec. 2.4). Each panel shows one representative specimen of the three tested per condition; the values in Table 2 are means over all three. Curves are shown to 10% strain (2.5% for the two brittle conditions); elongations to failure are listed in Table 2</w:t>
+        <w:t>from crosshead extension over the 127 mm gauge (Sec. 2.4). Each panel shows a single representative specimen; the values in Table 2 are means</w:t>
+      </w:r>
+      <w:r>
+        <w:t xml:space="preserve"> of </w:t>
+      </w:r>
+      <w:r>
+        <w:t>three specimens per condition. Curves are shown to 10% strain (2.5% for the two brittle conditions); elongations to failure are listed in Table 2</w:t>
       </w:r>
       <w:r>
         <w:t>.</w:t>
@@ -3018,7 +3024,7 @@
           <w:noProof/>
         </w:rPr>
         <w:drawing>
-          <wp:inline distT="0" distB="0" distL="0" distR="0" wp14:anchorId="3EB5CE49" wp14:editId="5FB79D5C">
+          <wp:inline distT="0" distB="0" distL="0" distR="0" wp14:anchorId="2E28520F" wp14:editId="5BE0DC18">
             <wp:extent cx="5522976" cy="2086356"/>
             <wp:effectExtent l="0" t="0" r="0" b="0"/>
             <wp:docPr id="36" name="Picture" descr="Fig. 3. Loading–unloading–heating tests of (a) the LLM-alloy and (b) the benchmark alloy, both heat treated at 1200 °C for 1 minute. Black arrows show the deformation path; the red arrow highlights the strain recovery caused by heating."/>
@@ -3546,7 +3552,7 @@
           <w:noProof/>
         </w:rPr>
         <w:drawing>
-          <wp:inline distT="0" distB="0" distL="0" distR="0" wp14:anchorId="221CC045" wp14:editId="4408D57B">
+          <wp:inline distT="0" distB="0" distL="0" distR="0" wp14:anchorId="5C686BF8" wp14:editId="2D02EE79">
             <wp:extent cx="5943600" cy="5802830"/>
             <wp:effectExtent l="0" t="0" r="0" b="0"/>
             <wp:docPr id="40" name="Picture" descr="Fig. 4. 2D synchrotron X-ray diffraction images of (a) LLM-alloy annealed at 1200 °C for 1 min, (b) annealed LLM-alloy after 10% tensile strain, (c) benchmark alloy annealed at 1200 °C for 1 min, and (d) annealed benchmark alloy after 8% tensile strain."/>
@@ -3636,7 +3642,7 @@
           <w:noProof/>
         </w:rPr>
         <w:drawing>
-          <wp:inline distT="0" distB="0" distL="0" distR="0" wp14:anchorId="21F2B54A" wp14:editId="7721970B">
+          <wp:inline distT="0" distB="0" distL="0" distR="0" wp14:anchorId="64836894" wp14:editId="204FE0B1">
             <wp:extent cx="2993136" cy="4465320"/>
             <wp:effectExtent l="0" t="0" r="0" b="0"/>
             <wp:docPr id="43" name="Picture" descr="Fig. 5. Comparison between synchrotron X-ray diffraction data (lower half of each panel) and results of Rietveld refinement (upper half of each panel) for the LLM-alloy: (a) heat-treated at 1200 °C for 1 minute (R_wp = 21.4%, R_p = 8.7%), and (b) after unloading from 10% strain (R_wp = 12.5%, R_p = 5.9%). Both refinements used the three-phase model of Sec. 2.5, with lattice parameters fixed at a = 3.6366 Å (γ) and 2.8865 Å (α) in both cases, and 5.7734 Å (a) and 5.7801 Å (b) for D0₃."/>
@@ -3738,7 +3744,7 @@
           <w:noProof/>
         </w:rPr>
         <w:drawing>
-          <wp:inline distT="0" distB="0" distL="0" distR="0" wp14:anchorId="5EAC85EB" wp14:editId="1B9A6B34">
+          <wp:inline distT="0" distB="0" distL="0" distR="0" wp14:anchorId="336BA17F" wp14:editId="431F4BA5">
             <wp:extent cx="5120640" cy="5943600"/>
             <wp:effectExtent l="0" t="0" r="0" b="0"/>
             <wp:docPr id="46" name="Picture" descr="Fig. 6. Azimuthally integrated X-ray diffraction spectra of (a) the LLM-alloy and (b) the benchmark alloy before and after deformation. Samples were heat treated at 1200 °C for 1 minute before deformation."/>
@@ -3819,7 +3825,7 @@
           <w:noProof/>
         </w:rPr>
         <w:drawing>
-          <wp:inline distT="0" distB="0" distL="0" distR="0" wp14:anchorId="0E0F73C6" wp14:editId="01D92A28">
+          <wp:inline distT="0" distB="0" distL="0" distR="0" wp14:anchorId="22A5CFDC" wp14:editId="4E23F95F">
             <wp:extent cx="3404616" cy="1234440"/>
             <wp:effectExtent l="0" t="0" r="0" b="0"/>
             <wp:docPr id="49" name="Picture" descr="Fig. 7. Inverse pole figures of the γ and α phases of the LLM-alloy along the wire axis, extracted from the E-WIMV orientation-distribution refinement of Sec. 2.5. The sample was heat treated at 1200 °C for 1 minute. Intensities are in multiples of a random distribution."/>
@@ -3885,7 +3891,7 @@
           <w:noProof/>
         </w:rPr>
         <w:drawing>
-          <wp:inline distT="0" distB="0" distL="0" distR="0" wp14:anchorId="0332EEFE" wp14:editId="54072B11">
+          <wp:inline distT="0" distB="0" distL="0" distR="0" wp14:anchorId="5522922B" wp14:editId="2A4E619A">
             <wp:extent cx="3566160" cy="3410712"/>
             <wp:effectExtent l="0" t="0" r="0" b="0"/>
             <wp:docPr id="52" name="Picture" descr="Fig. 8. Synchrotron X-ray diffraction image of the LLM-alloy after the abnormal-grain-growth heat treatment of Sec. 2.2. The vertical direction from the beam center corresponds to the wire axis. The pattern contains the same γ, α and D0₃ reflections as Fig. 4a, with the ring intensity resolved into discrete spots."/>
@@ -4453,7 +4459,7 @@
           <w:noProof/>
         </w:rPr>
         <w:drawing>
-          <wp:inline distT="0" distB="0" distL="0" distR="0" wp14:anchorId="320BFCC5" wp14:editId="10ECDC59">
+          <wp:inline distT="0" distB="0" distL="0" distR="0" wp14:anchorId="1C030C97" wp14:editId="3C06C6CF">
             <wp:extent cx="5943600" cy="2075542"/>
             <wp:effectExtent l="0" t="0" r="0" b="0"/>
             <wp:docPr id="56" name="Picture" descr="Fig. 9. Calculated equilibrium step diagrams (mpea-02b database) for (a) the benchmark alloy, (b) the LLM-hypothesized alloy and (c) the same LLM-alloy chemistry with carbon deleted and every other element held fixed — the virtual control of Sec. 2.6. Panels (a) and (b) were computed from the measured ICP-AES chemistries of Table 1 converted from wt% to at%: Fe–34.1Mn–15.2Al–7.8Ni–0.04C and Fe–29.8Mn–11.9Al–4.2Ni–2.04Si–0.45C respectively. mpea-02b does not model Si, which was therefore omitted and the remaining elements renormalized (Sec. 2.6). The shaded band is the ordered (B2) portion of the total bcc fraction; it lies beneath the total bcc curve because B2 is an ordered partition of that phase rather than a separate one. The dashed line marks the 1200 °C solution-treatment temperature: it lies outside the single-phase α field in (b) and inside it in (c). The carbon-free control is also reported numerically in Table 3."/>
@@ -4826,7 +4832,7 @@
     </w:p>
     <w:p>
       <w:r>
-        <w:pict w14:anchorId="69CE0072">
+        <w:pict w14:anchorId="6B05D7C0">
           <v:rect id="_x0000_i1029" style="width:0;height:1.5pt" o:hralign="center" o:hrstd="t" o:hr="t"/>
         </w:pict>
       </w:r>
@@ -5713,7 +5719,7 @@
     </w:p>
     <w:p>
       <w:r>
-        <w:pict w14:anchorId="1EF40582">
+        <w:pict w14:anchorId="5A32D7CF">
           <v:rect id="_x0000_i1030" style="width:0;height:1.5pt" o:hralign="center" o:hrstd="t" o:hr="t"/>
         </w:pict>
       </w:r>
@@ -5810,7 +5816,7 @@
     </w:p>
     <w:p>
       <w:r>
-        <w:pict w14:anchorId="12841BE1">
+        <w:pict w14:anchorId="6B8E122A">
           <v:rect id="_x0000_i1031" style="width:0;height:1.5pt" o:hralign="center" o:hrstd="t" o:hr="t"/>
         </w:pict>
       </w:r>
@@ -5843,7 +5849,7 @@
     </w:p>
     <w:p>
       <w:r>
-        <w:pict w14:anchorId="712E3D6F">
+        <w:pict w14:anchorId="445BB9A9">
           <v:rect id="_x0000_i1032" style="width:0;height:1.5pt" o:hralign="center" o:hrstd="t" o:hr="t"/>
         </w:pict>
       </w:r>
@@ -5950,7 +5956,7 @@
     </w:p>
     <w:p>
       <w:r>
-        <w:pict w14:anchorId="15F7BC18">
+        <w:pict w14:anchorId="0DEE7186">
           <v:rect id="_x0000_i1033" style="width:0;height:1.5pt" o:hralign="center" o:hrstd="t" o:hr="t"/>
         </w:pict>
       </w:r>
@@ -7002,7 +7008,7 @@
   <w:num w:numId="1" w16cid:durableId="1561406982">
     <w:abstractNumId w:val="0"/>
   </w:num>
-  <w:num w:numId="2" w16cid:durableId="1487672513">
+  <w:num w:numId="2" w16cid:durableId="1445998214">
     <w:abstractNumId w:val="0"/>
   </w:num>
 </w:numbering>
@@ -8220,7 +8226,7 @@
   <w:style w:type="paragraph" w:styleId="Revision">
     <w:name w:val="Revision"/>
     <w:hidden/>
-    <w:rsid w:val="007F2991"/>
+    <w:rsid w:val="00113602"/>
     <w:pPr>
       <w:spacing w:after="0"/>
     </w:pPr>

</xml_diff>